<commit_message>
aligning syuruq time in prayer time section
</commit_message>
<xml_diff>
--- a/Manual Pengguna Sistem Paparan surau.docx
+++ b/Manual Pengguna Sistem Paparan surau.docx
@@ -52,7 +52,7 @@
           <w:r>
             <w:fldChar w:fldCharType="separate"/>
           </w:r>
-          <w:hyperlink w:anchor="_Toc224494221" w:history="1">
+          <w:hyperlink w:anchor="_Toc224494512" w:history="1">
             <w:r>
               <w:rPr>
                 <w:rStyle w:val="Hyperlink"/>
@@ -79,7 +79,7 @@
                 <w:noProof/>
                 <w:webHidden/>
               </w:rPr>
-              <w:instrText xml:space="preserve"> PAGEREF _Toc224494221 \h </w:instrText>
+              <w:instrText xml:space="preserve"> PAGEREF _Toc224494512 \h </w:instrText>
             </w:r>
             <w:r>
               <w:rPr>
@@ -120,7 +120,7 @@
               <w:noProof/>
             </w:rPr>
           </w:pPr>
-          <w:hyperlink w:anchor="_Toc224494222" w:history="1">
+          <w:hyperlink w:anchor="_Toc224494513" w:history="1">
             <w:r>
               <w:rPr>
                 <w:rStyle w:val="Hyperlink"/>
@@ -147,7 +147,7 @@
                 <w:noProof/>
                 <w:webHidden/>
               </w:rPr>
-              <w:instrText xml:space="preserve"> PAGEREF _Toc224494222 \h </w:instrText>
+              <w:instrText xml:space="preserve"> PAGEREF _Toc224494513 \h </w:instrText>
             </w:r>
             <w:r>
               <w:rPr>
@@ -188,7 +188,7 @@
               <w:noProof/>
             </w:rPr>
           </w:pPr>
-          <w:hyperlink w:anchor="_Toc224494223" w:history="1">
+          <w:hyperlink w:anchor="_Toc224494514" w:history="1">
             <w:r>
               <w:rPr>
                 <w:rStyle w:val="Hyperlink"/>
@@ -215,7 +215,7 @@
                 <w:noProof/>
                 <w:webHidden/>
               </w:rPr>
-              <w:instrText xml:space="preserve"> PAGEREF _Toc224494223 \h </w:instrText>
+              <w:instrText xml:space="preserve"> PAGEREF _Toc224494514 \h </w:instrText>
             </w:r>
             <w:r>
               <w:rPr>
@@ -256,7 +256,7 @@
               <w:noProof/>
             </w:rPr>
           </w:pPr>
-          <w:hyperlink w:anchor="_Toc224494224" w:history="1">
+          <w:hyperlink w:anchor="_Toc224494515" w:history="1">
             <w:r>
               <w:rPr>
                 <w:rStyle w:val="Hyperlink"/>
@@ -283,7 +283,7 @@
                 <w:noProof/>
                 <w:webHidden/>
               </w:rPr>
-              <w:instrText xml:space="preserve"> PAGEREF _Toc224494224 \h </w:instrText>
+              <w:instrText xml:space="preserve"> PAGEREF _Toc224494515 \h </w:instrText>
             </w:r>
             <w:r>
               <w:rPr>
@@ -324,7 +324,7 @@
               <w:noProof/>
             </w:rPr>
           </w:pPr>
-          <w:hyperlink w:anchor="_Toc224494225" w:history="1">
+          <w:hyperlink w:anchor="_Toc224494516" w:history="1">
             <w:r>
               <w:rPr>
                 <w:rStyle w:val="Hyperlink"/>
@@ -351,7 +351,7 @@
                 <w:noProof/>
                 <w:webHidden/>
               </w:rPr>
-              <w:instrText xml:space="preserve"> PAGEREF _Toc224494225 \h </w:instrText>
+              <w:instrText xml:space="preserve"> PAGEREF _Toc224494516 \h </w:instrText>
             </w:r>
             <w:r>
               <w:rPr>
@@ -392,7 +392,7 @@
               <w:noProof/>
             </w:rPr>
           </w:pPr>
-          <w:hyperlink w:anchor="_Toc224494226" w:history="1">
+          <w:hyperlink w:anchor="_Toc224494517" w:history="1">
             <w:r>
               <w:rPr>
                 <w:rStyle w:val="Hyperlink"/>
@@ -419,7 +419,7 @@
                 <w:noProof/>
                 <w:webHidden/>
               </w:rPr>
-              <w:instrText xml:space="preserve"> PAGEREF _Toc224494226 \h </w:instrText>
+              <w:instrText xml:space="preserve"> PAGEREF _Toc224494517 \h </w:instrText>
             </w:r>
             <w:r>
               <w:rPr>
@@ -460,7 +460,7 @@
               <w:noProof/>
             </w:rPr>
           </w:pPr>
-          <w:hyperlink w:anchor="_Toc224494227" w:history="1">
+          <w:hyperlink w:anchor="_Toc224494518" w:history="1">
             <w:r>
               <w:rPr>
                 <w:rStyle w:val="Hyperlink"/>
@@ -487,7 +487,7 @@
                 <w:noProof/>
                 <w:webHidden/>
               </w:rPr>
-              <w:instrText xml:space="preserve"> PAGEREF _Toc224494227 \h </w:instrText>
+              <w:instrText xml:space="preserve"> PAGEREF _Toc224494518 \h </w:instrText>
             </w:r>
             <w:r>
               <w:rPr>
@@ -528,7 +528,7 @@
               <w:noProof/>
             </w:rPr>
           </w:pPr>
-          <w:hyperlink w:anchor="_Toc224494228" w:history="1">
+          <w:hyperlink w:anchor="_Toc224494519" w:history="1">
             <w:r>
               <w:rPr>
                 <w:rStyle w:val="Hyperlink"/>
@@ -555,7 +555,7 @@
                 <w:noProof/>
                 <w:webHidden/>
               </w:rPr>
-              <w:instrText xml:space="preserve"> PAGEREF _Toc224494228 \h </w:instrText>
+              <w:instrText xml:space="preserve"> PAGEREF _Toc224494519 \h </w:instrText>
             </w:r>
             <w:r>
               <w:rPr>
@@ -636,7 +636,7 @@
       <w:pPr>
         <w:pStyle w:val="Heading2"/>
       </w:pPr>
-      <w:bookmarkStart w:id="0" w:name="_Toc224494221"/>
+      <w:bookmarkStart w:id="0" w:name="_Toc224494512"/>
       <w:r>
         <w:t xml:space="preserve">Manual </w:t>
       </w:r>
@@ -901,7 +901,7 @@
       <w:pPr>
         <w:pStyle w:val="Heading2"/>
       </w:pPr>
-      <w:bookmarkStart w:id="1" w:name="_Toc224494222"/>
+      <w:bookmarkStart w:id="1" w:name="_Toc224494513"/>
       <w:r>
         <w:rPr>
           <w:noProof/>
@@ -1619,7 +1619,7 @@
       <w:r>
         <w:t xml:space="preserve"> </w:t>
       </w:r>
-      <w:bookmarkStart w:id="2" w:name="_Toc224494223"/>
+      <w:bookmarkStart w:id="2" w:name="_Toc224494514"/>
       <w:r>
         <w:t xml:space="preserve">2. Panduan </w:t>
       </w:r>
@@ -2755,7 +2755,7 @@
       <w:pPr>
         <w:pStyle w:val="Heading2"/>
       </w:pPr>
-      <w:bookmarkStart w:id="3" w:name="_Toc224494224"/>
+      <w:bookmarkStart w:id="3" w:name="_Toc224494515"/>
       <w:r>
         <w:rPr>
           <w:noProof/>
@@ -3462,7 +3462,7 @@
         <w:lastRenderedPageBreak/>
         <w:t xml:space="preserve"> </w:t>
       </w:r>
-      <w:bookmarkStart w:id="4" w:name="_Toc224494225"/>
+      <w:bookmarkStart w:id="4" w:name="_Toc224494516"/>
       <w:r>
         <w:t xml:space="preserve">4. </w:t>
       </w:r>
@@ -4529,7 +4529,7 @@
           <w:noProof/>
         </w:rPr>
         <w:drawing>
-          <wp:anchor distT="0" distB="0" distL="114300" distR="114300" simplePos="0" relativeHeight="251679744" behindDoc="0" locked="0" layoutInCell="1" allowOverlap="1" wp14:anchorId="01119401" wp14:editId="6689845F">
+          <wp:anchor distT="0" distB="0" distL="114300" distR="114300" simplePos="0" relativeHeight="251679744" behindDoc="0" locked="0" layoutInCell="1" allowOverlap="1" wp14:anchorId="01119401" wp14:editId="7425D75F">
             <wp:simplePos x="0" y="0"/>
             <wp:positionH relativeFrom="column">
               <wp:posOffset>3771900</wp:posOffset>
@@ -5238,7 +5238,7 @@
           <w:noProof/>
         </w:rPr>
         <w:drawing>
-          <wp:anchor distT="0" distB="0" distL="114300" distR="114300" simplePos="0" relativeHeight="251668862" behindDoc="0" locked="0" layoutInCell="1" allowOverlap="1" wp14:anchorId="25BA4990" wp14:editId="3A12B192">
+          <wp:anchor distT="0" distB="0" distL="114300" distR="114300" simplePos="0" relativeHeight="251668862" behindDoc="0" locked="0" layoutInCell="1" allowOverlap="1" wp14:anchorId="25BA4990" wp14:editId="157CE9E6">
             <wp:simplePos x="0" y="0"/>
             <wp:positionH relativeFrom="column">
               <wp:posOffset>2705100</wp:posOffset>
@@ -6492,7 +6492,7 @@
       <w:pPr>
         <w:pStyle w:val="Heading2"/>
       </w:pPr>
-      <w:bookmarkStart w:id="5" w:name="_Toc224494226"/>
+      <w:bookmarkStart w:id="5" w:name="_Toc224494517"/>
       <w:r>
         <w:rPr>
           <w:noProof/>
@@ -7091,7 +7091,7 @@
       <w:r>
         <w:t xml:space="preserve"> </w:t>
       </w:r>
-      <w:bookmarkStart w:id="6" w:name="_Toc224494227"/>
+      <w:bookmarkStart w:id="6" w:name="_Toc224494518"/>
       <w:r>
         <w:t xml:space="preserve">6. </w:t>
       </w:r>
@@ -7650,7 +7650,7 @@
       <w:pPr>
         <w:pStyle w:val="Heading2"/>
       </w:pPr>
-      <w:bookmarkStart w:id="7" w:name="_Toc224494228"/>
+      <w:bookmarkStart w:id="7" w:name="_Toc224494519"/>
       <w:r>
         <w:lastRenderedPageBreak/>
         <w:t>7. P</w:t>

</xml_diff>